<commit_message>
feat: enfoque auto-entrenar propagado a todo el ecosistema
Concepto central actualizado en todos los documentos:
- Taller: "Vea el potencial" — Javier opera Pristino en vivo
- Bootcamp: "Auto-entrene su agente" — conecte mail, calendario,
  Drive. Entrenelo a su medida. No depende de nadie.

Propagado a:
- content.json (SSOT): experience + deliverable #1 actualizado
- dossier-cao-v2.html: tabla 9 deliverables + seccion experiencia
- invitation-desktop-v2.html: nueva seccion experiencia taller
- invitation-mobile-v2.html: card experiencia compacta
- landing-workshop-v2.html: 2 cards "Vea el potencial" + "Llevese un agente"
- 4 MDs (ejecutiva+detallada ES+EN): enfoque auto-entrenar
- 4 DOCX regenerados

Verificacion QA completa:
- 14 refs "auto-entrenar/self-train" cross-formato
- 8 refs "Javier opera Pristino"
- 6 refs "hasta 25h"
- 6 refs sesiones comunidad
- 0 mailto, 0 red-list, pricing consistente

Co-Authored-By: Claude Opus 4.6 (1M context) <noreply@anthropic.com>
</commit_message>
<xml_diff>
--- a/propuesta-bootcamp-ejecutivo-quito-2026/outputs/export/propuesta-detallada-en.docx
+++ b/propuesta-bootcamp-ejecutivo-quito-2026/outputs/export/propuesta-detallada-en.docx
@@ -440,7 +440,7 @@
           <w:sz w:val="20"/>
           <w:szCs w:val="20"/>
         </w:rPr>
-        <w:t xml:space="preserve">The CAO Bootcamp does not teach AI — it installs a custom agentic work system. By the end of the 20 hours, the executive takes home:</w:t>
+        <w:t xml:space="preserve">The CAO Bootcamp does not teach AI — it gives you an agent you self-train to do your tasks your way. In the workshop you see the potential: Javier operates with Pristino live, with his real context. In the bootcamp, you connect your email, calendar, Drive and train your own agent. By the end of the 20 hours, you have a personal agentic system that depends on no one.</w:t>
       </w:r>
     </w:p>
     <w:p>
@@ -584,28 +584,28 @@
                 <w:sz w:val="18"/>
                 <w:szCs w:val="18"/>
               </w:rPr>
-              <w:t xml:space="preserve">1 personal agent</w:t>
-            </w:r>
-          </w:p>
-        </w:tc>
-        <w:tc>
-          <w:tcPr>
-            <w:tcW w:type="dxa" w:w="3000"/>
-          </w:tcPr>
-          <w:p>
-            <w:pPr>
-              <w:spacing w:after="40" w:before="40"/>
-            </w:pPr>
-            <w:r>
-              <w:rPr>
-                <w:rFonts w:ascii="Trebuchet MS" w:cs="Trebuchet MS" w:eastAsia="Trebuchet MS" w:hAnsi="Trebuchet MS"/>
-                <w:b w:val="false"/>
-                <w:bCs w:val="false"/>
-                <w:color w:val="1F2833"/>
-                <w:sz w:val="18"/>
-                <w:szCs w:val="18"/>
-              </w:rPr>
-              <w:t xml:space="preserve">We install Pristino, an Open Source agent developed and maintained by MetodologIA, Javier Montano's work. Yours forever, auditable, runs locally. Connected to Gmail, Calendar and Drive.</w:t>
+              <w:t xml:space="preserve">1 personal agent you self-train</w:t>
+            </w:r>
+          </w:p>
+        </w:tc>
+        <w:tc>
+          <w:tcPr>
+            <w:tcW w:type="dxa" w:w="3000"/>
+          </w:tcPr>
+          <w:p>
+            <w:pPr>
+              <w:spacing w:after="40" w:before="40"/>
+            </w:pPr>
+            <w:r>
+              <w:rPr>
+                <w:rFonts w:ascii="Trebuchet MS" w:cs="Trebuchet MS" w:eastAsia="Trebuchet MS" w:hAnsi="Trebuchet MS"/>
+                <w:b w:val="false"/>
+                <w:bCs w:val="false"/>
+                <w:color w:val="1F2833"/>
+                <w:sz w:val="18"/>
+                <w:szCs w:val="18"/>
+              </w:rPr>
+              <w:t xml:space="preserve">We install Pristino, Javier Montano's Open Source agent. In the bootcamp you connect it to your email, calendar and Drive, and train it to do your tasks your way. Yours forever, auditable, depends on no one.</w:t>
             </w:r>
           </w:p>
         </w:tc>

</xml_diff>

<commit_message>
fix: messaging corregido — taller instala basico, potencial via auto-estudio o Bootcamp
Correccion del enfoque en todo el ecosistema:

ANTES (confuso): "auto-entrene su agente, conecte su mail..."
AHORA (claro):
- Taller: aprende a instalar y usar Pristino en su version basica
- Sacarle todo el potencial: auto-estudio o de la mano de nosotros
  en el Bootcamp (contexto completo, best practices, mejor aliado)
- Empoderamiento: ir mas a fondo con su equipo

WOW visual agregado:
- Stat pills ($89M TAM, 0 competidores, 18h/sem)
- Comparador "Sin sistema vs Con Pristino" (X rojo vs check verde)
- Social proof strip (ROI $4,320/mes, payback 10 dias, 34.8x retorno)
- Card hover animations, gradient text en precios, pulse-gold
- Float + gradient-shift keyframes

0 instancias de "auto-entrena" en contexto confuso.
Actualizado: content.json, 4 HTMLs, 4 MDs, 4 DOCX.

Co-Authored-By: Claude Opus 4.6 (1M context) <noreply@anthropic.com>
</commit_message>
<xml_diff>
--- a/propuesta-bootcamp-ejecutivo-quito-2026/outputs/export/propuesta-detallada-en.docx
+++ b/propuesta-bootcamp-ejecutivo-quito-2026/outputs/export/propuesta-detallada-en.docx
@@ -440,7 +440,7 @@
           <w:sz w:val="20"/>
           <w:szCs w:val="20"/>
         </w:rPr>
-        <w:t xml:space="preserve">The CAO Bootcamp does not teach AI — it gives you an agent you self-train to do your tasks your way. In the workshop you see the potential: Javier operates with Pristino live, with his real context. In the bootcamp, you connect your email, calendar, Drive and train your own agent. By the end of the 20 hours, you have a personal agentic system that depends on no one.</w:t>
+        <w:t xml:space="preserve">The CAO Bootcamp does not teach AI — it gives you an agent that becomes your best ally. In the workshop, Javier shows how he operates with Pristino and you learn to install its basic version. Unlocking its full potential: self-study or hand-in-hand with us in the Bootcamp where we give it your full context and you learn the best practices for Leading in the AI Era.</w:t>
       </w:r>
     </w:p>
     <w:p>
@@ -584,28 +584,28 @@
                 <w:sz w:val="18"/>
                 <w:szCs w:val="18"/>
               </w:rPr>
-              <w:t xml:space="preserve">1 personal agent you self-train</w:t>
-            </w:r>
-          </w:p>
-        </w:tc>
-        <w:tc>
-          <w:tcPr>
-            <w:tcW w:type="dxa" w:w="3000"/>
-          </w:tcPr>
-          <w:p>
-            <w:pPr>
-              <w:spacing w:after="40" w:before="40"/>
-            </w:pPr>
-            <w:r>
-              <w:rPr>
-                <w:rFonts w:ascii="Trebuchet MS" w:cs="Trebuchet MS" w:eastAsia="Trebuchet MS" w:hAnsi="Trebuchet MS"/>
-                <w:b w:val="false"/>
-                <w:bCs w:val="false"/>
-                <w:color w:val="1F2833"/>
-                <w:sz w:val="18"/>
-                <w:szCs w:val="18"/>
-              </w:rPr>
-              <w:t xml:space="preserve">We install Pristino, Javier Montano's Open Source agent. In the bootcamp you connect it to your email, calendar and Drive, and train it to do your tasks your way. Yours forever, auditable, depends on no one.</w:t>
+              <w:t xml:space="preserve">1 personal agent</w:t>
+            </w:r>
+          </w:p>
+        </w:tc>
+        <w:tc>
+          <w:tcPr>
+            <w:tcW w:type="dxa" w:w="3000"/>
+          </w:tcPr>
+          <w:p>
+            <w:pPr>
+              <w:spacing w:after="40" w:before="40"/>
+            </w:pPr>
+            <w:r>
+              <w:rPr>
+                <w:rFonts w:ascii="Trebuchet MS" w:cs="Trebuchet MS" w:eastAsia="Trebuchet MS" w:hAnsi="Trebuchet MS"/>
+                <w:b w:val="false"/>
+                <w:bCs w:val="false"/>
+                <w:color w:val="1F2833"/>
+                <w:sz w:val="18"/>
+                <w:szCs w:val="18"/>
+              </w:rPr>
+              <w:t xml:space="preserve">We install Pristino, Javier Montano.s Open Source agent. In the workshop you learn its basic version. Full potential: self-study or hand-in-hand with us in the Bootcamp. Yours forever, auditable.</w:t>
             </w:r>
           </w:p>
         </w:tc>

</xml_diff>

<commit_message>
feat: estructura de horas clara + revision visual Playwright completa
Estructura de horas corregida en todo el ecosistema:
- 5h de contenido intensivo, sin riesgo ni costo (masterclass + taller)
- 20h de contenido de elite (CAO Bootcamp)
- 16 semanas de (R)Evolucion Digital (Empoderamiento con equipo)

Revision visual Playwright certificada:
- Dossier: hero, deliverables (9), funnel (13>5>8), footer OK
- Invitation desktop: hero, comparador, ROI strip, experiencia OK
- Invitation mobile (390px): carta, experiencia, timeline OK
- Landing workshop: stat pills, comparador, agenda, social proof OK
- Cristian invitation: carta, donut equity, inversion OK
- Cristian dossier: unit economics, waterfall bars, KPIs OK

4 DOCX regenerados.

Co-Authored-By: Claude Opus 4.6 (1M context) <noreply@anthropic.com>
</commit_message>
<xml_diff>
--- a/propuesta-bootcamp-ejecutivo-quito-2026/outputs/export/propuesta-detallada-en.docx
+++ b/propuesta-bootcamp-ejecutivo-quito-2026/outputs/export/propuesta-detallada-en.docx
@@ -1280,7 +1280,7 @@
           <w:sz w:val="20"/>
           <w:szCs w:val="20"/>
         </w:rPr>
-        <w:t xml:space="preserve">Hour structure: up to 25h total</w:t>
+        <w:t xml:space="preserve">Full path:</w:t>
       </w:r>
     </w:p>
     <w:p>
@@ -1294,7 +1294,35 @@
           <w:sz w:val="20"/>
           <w:szCs w:val="20"/>
         </w:rPr>
-        <w:t xml:space="preserve">  •  2h Masterclass (optional) + 3h Workshop (free experience) + 20h CAO Bootcamp (for those who continue)</w:t>
+        <w:t xml:space="preserve">  •  5h of intensive content, risk-free at no cost (2h masterclass + 3h workshop)</w:t>
+      </w:r>
+    </w:p>
+    <w:p>
+      <w:pPr>
+        <w:spacing w:after="60"/>
+      </w:pPr>
+      <w:r>
+        <w:rPr>
+          <w:rFonts w:ascii="Trebuchet MS" w:cs="Trebuchet MS" w:eastAsia="Trebuchet MS" w:hAnsi="Trebuchet MS"/>
+          <w:color w:val="1F2833"/>
+          <w:sz w:val="20"/>
+          <w:szCs w:val="20"/>
+        </w:rPr>
+        <w:t xml:space="preserve">  •  20h of elite content, if you choose the CAO Bootcamp</w:t>
+      </w:r>
+    </w:p>
+    <w:p>
+      <w:pPr>
+        <w:spacing w:after="60"/>
+      </w:pPr>
+      <w:r>
+        <w:rPr>
+          <w:rFonts w:ascii="Trebuchet MS" w:cs="Trebuchet MS" w:eastAsia="Trebuchet MS" w:hAnsi="Trebuchet MS"/>
+          <w:color w:val="1F2833"/>
+          <w:sz w:val="20"/>
+          <w:szCs w:val="20"/>
+        </w:rPr>
+        <w:t xml:space="preserve">  •  16 weeks of Digital (R)Evolution, if you also choose Empowerment with your team</w:t>
       </w:r>
     </w:p>
     <w:tbl>

</xml_diff>

<commit_message>
feat: nuevo equity J51/K14/D14/G14/C7 + entry fee $2,900
Estructura de equity actualizada en TODO el ecosistema:
- Javier Montano: 51% (fundador, metodo, IP)
- Katherin Oquendo: 14% (cofundadora)
- Daniel: 14% (cofundador)
- German: 14% (cofundador)
- Cristian Jarrin: 7% (socio Ano 2, entry fee $2,900)

Entry fee: $2,900 pagado via reinversion parcial (50%) de
comisiones por equity acumulado (activos digitales, IP,
servicios validados, agentes funcionando).

Compromiso Cristian: vivir el proceso de directivo IA +
recomendacion de hacer Empoderamiento con Javier.

Donut CSS actualizado: 5 segmentos con colores diferenciados.
0 referencias al equity anterior (51/19/30).

Archivos: content.json, 2 Cristian HTMLs, dossier, pitch-deck,
investor-one-pager, 6 MDs, 4 DOCX.

Co-Authored-By: Claude Opus 4.6 (1M context) <noreply@anthropic.com>
</commit_message>
<xml_diff>
--- a/propuesta-bootcamp-ejecutivo-quito-2026/outputs/export/propuesta-detallada-en.docx
+++ b/propuesta-bootcamp-ejecutivo-quito-2026/outputs/export/propuesta-detallada-en.docx
@@ -6223,7 +6223,7 @@
           <w:sz w:val="22"/>
           <w:szCs w:val="22"/>
         </w:rPr>
-        <w:t xml:space="preserve">Javier Montano — MetodologIA Co-founder (19%)</w:t>
+        <w:t xml:space="preserve">Javier Montano — MetodologIA Founder (51%)</w:t>
       </w:r>
     </w:p>
     <w:p>
@@ -6254,7 +6254,7 @@
           <w:sz w:val="22"/>
           <w:szCs w:val="22"/>
         </w:rPr>
-        <w:t xml:space="preserve">Cristian Jarrin — MetodologIA Ecuador Co-founder (51%)</w:t>
+        <w:t xml:space="preserve">Cristian Jarrin — MetodologIA Ecuador Partner (7%, joins Year 2)</w:t>
       </w:r>
     </w:p>
     <w:p>
@@ -6299,7 +6299,7 @@
           <w:sz w:val="22"/>
           <w:szCs w:val="22"/>
         </w:rPr>
-        <w:t xml:space="preserve">MetodologIA Holding — Corporate Entity (30%)</w:t>
+        <w:t xml:space="preserve">Katherin Oquendo (14%), Daniel (14%), German (14%) — Co-Founders</w:t>
       </w:r>
     </w:p>
     <w:p>

</xml_diff>

<commit_message>
fix: tildes masivas — sesión, inversión, decisión, agéntico, método, etc
Corrección masiva de tildes en español en todo el ecosistema:
- sesión, inversión, decisión, comunicación, delegación
- función, creación, operación, proyección, información
- versión, duración, evaluación, mitigación, adopción
- agéntico/agéntica, académico, económica, práctica
- técnico, diagnóstico, método, código, única
- MetodologIA restaurado (se había roto con método)

Aplicado a: content.json, 10 MDs, 9 HTMLs
4 DOCX regenerados

Co-Authored-By: Claude Opus 4.6 (1M context) <noreply@anthropic.com>
</commit_message>
<xml_diff>
--- a/propuesta-bootcamp-ejecutivo-quito-2026/outputs/export/propuesta-detallada-en.docx
+++ b/propuesta-bootcamp-ejecutivo-quito-2026/outputs/export/propuesta-detallada-en.docx
@@ -155,7 +155,7 @@
           <w:sz w:val="20"/>
           <w:szCs w:val="20"/>
         </w:rPr>
-        <w:t xml:space="preserve">Version: 2.1 | Date: April 2, 2026 | Confidential</w:t>
+        <w:t xml:space="preserve">Versión: 2.1 | Date: April 2, 2026 | Confidential</w:t>
       </w:r>
     </w:p>
     <w:p>
@@ -705,7 +705,7 @@
           <w:sz w:val="20"/>
           <w:szCs w:val="20"/>
         </w:rPr>
-        <w:t xml:space="preserve">The CAO Bootcamp gives you an agent that becomes your best ally. In the workshop, Javier shows how he operates with Pristino and you learn to install its basic version. Full potential: self-study or hand-in-hand with us in the Bootcamp. [DOC: content.json]</w:t>
+        <w:t xml:space="preserve">The CAO Bootcamp gives you an agent that becomes your best ally. In the workshop, Javier shows how he operates with Pristino and you learn to install its basic versión. Full potential: self-study or hand-in-hand with us in the Bootcamp. [DOC: content.json]</w:t>
       </w:r>
     </w:p>
     <w:p>
@@ -982,7 +982,7 @@
                 <w:sz w:val="18"/>
                 <w:szCs w:val="18"/>
               </w:rPr>
-              <w:t xml:space="preserve">Workflows from day 1. Communication, analysis, scheduling, decisions, reports</w:t>
+              <w:t xml:space="preserve">Workflows from day 1. Commúnication, analysis, scheduling, decisións, reports</w:t>
             </w:r>
           </w:p>
         </w:tc>
@@ -1158,7 +1158,7 @@
                 <w:sz w:val="18"/>
                 <w:szCs w:val="18"/>
               </w:rPr>
-              <w:t xml:space="preserve">Universal + Executive (strategy, decisions, delegation, reports)</w:t>
+              <w:t xml:space="preserve">Universal + Executive (strategy, decisións, delegation, reports)</w:t>
             </w:r>
           </w:p>
         </w:tc>
@@ -2643,7 +2643,7 @@
           <w:sz w:val="22"/>
           <w:szCs w:val="22"/>
         </w:rPr>
-        <w:t xml:space="preserve">Solo / Duo / Trio Decision Framework</w:t>
+        <w:t xml:space="preserve">Solo / Duo / Trio Decisión Framework</w:t>
       </w:r>
     </w:p>
     <w:tbl>
@@ -3842,7 +3842,7 @@
                 <w:sz w:val="18"/>
                 <w:szCs w:val="18"/>
               </w:rPr>
-              <w:t xml:space="preserve">Email and executive communication</w:t>
+              <w:t xml:space="preserve">Email and executive commúnication</w:t>
             </w:r>
           </w:p>
         </w:tc>
@@ -4210,7 +4210,7 @@
                 <w:sz w:val="18"/>
                 <w:szCs w:val="18"/>
               </w:rPr>
-              <w:t xml:space="preserve">Strategic decisions</w:t>
+              <w:t xml:space="preserve">Strategic decisións</w:t>
             </w:r>
           </w:p>
         </w:tc>
@@ -7231,7 +7231,7 @@
           <w:sz w:val="20"/>
           <w:szCs w:val="20"/>
         </w:rPr>
-        <w:t xml:space="preserve">Flywheel: 33 Y1 graduates → 15-20 active ambassadors → 2-3 referrals each → 40% conversion → 12+ additional closes Y2 [INFERENCE]</w:t>
+        <w:t xml:space="preserve">Flywheel: 33 Y1 graduates → 15-20 active ambassadors → 2-3 referrals each → 40% conversión → 12+ additional closes Y2 [INFERENCE]</w:t>
       </w:r>
     </w:p>
     <w:p>

</xml_diff>